<commit_message>
court(wva): petition-for-review gated, docx reported (fb-595.54.21)
Re-rendered on master's model: note 48 is set in LaTeX again; latex_bias 0.02
keeps the p25 heading line as typst breaks it (1074/1074 lines). Word's footnote
area on p12 is reported (B7) (fb-595.54.21).

Co-Authored-By: Claude Opus 5.5 <noreply@anthropic.com>
</commit_message>
<xml_diff>
--- a/courts/fourth-circuit/west-virginia/state/supreme-court/petition-for-review/usage/OUTPUT-petition-for-review.docx
+++ b/courts/fourth-circuit/west-virginia/state/supreme-court/petition-for-review/usage/OUTPUT-petition-for-review.docx
@@ -3760,7 +3760,7 @@
         <w:tab/>
       </w:r>
       <w:r>
-        <w:t xml:space="preserve">15, 21</w:t>
+        <w:t xml:space="preserve">15, 21, 22</w:t>
       </w:r>
     </w:p>
     <w:p>
@@ -4951,7 +4951,7 @@
           <w:tab w:val="right" w:leader="dot" w:pos="9360"/>
         </w:tabs>
         <w:spacing w:before="168" w:after="0" w:line="276" w:lineRule="exact"/>
-        <w:ind w:left="576" w:right="1120" w:hanging="576"/>
+        <w:ind w:left="576" w:right="1200" w:hanging="576"/>
       </w:pPr>
       <w:r>
         <w:t xml:space="preserve">W.</w:t>
@@ -4997,7 +4997,7 @@
         <w:tab/>
       </w:r>
       <w:r>
-        <w:t xml:space="preserve">7, 16, 21</w:t>
+        <w:t xml:space="preserve">7, 16, 17, 21</w:t>
       </w:r>
     </w:p>
     <w:p>
@@ -6337,7 +6337,7 @@
         <w:tab/>
       </w:r>
       <w:r>
-        <w:t xml:space="preserve">14, 27</w:t>
+        <w:t xml:space="preserve">14, 27, 28</w:t>
       </w:r>
     </w:p>
     <w:p>
@@ -7452,7 +7452,7 @@
         <w:noBreakHyphen/>
       </w:r>
       <w:r>
-        <w:t xml:space="preserve">8, which grants municipalities superior rights to serve unserved territory within their municipal boundaries over Public Service Districts. However, BWC is not a Public Service District. It is a for-profit utility. . . . If the Legislature intended to give superior rights to a municipal utility over private utilities, it could have done so. It has not done so. The City has no ability to prevent BWC from serving customers within BWC’s exclusive service territory in or out of the City’s municipal boundaries.</w:t>
+        <w:t xml:space="preserve">8, which grants municipalities superior rights to serve unserved territory within their municipal boundaries over Public Service Districts. However, BWC is not a Public Service District. It is a for-profit utility. ⁠. ⁠. ⁠. If the Legislature intended to give superior rights to a municipal utility over private utilities, it could have done so. It has not done so. The City has no ability to prevent BWC from serving customers within BWC’s exclusive service territory in or out of the City’s municipal boundaries.</w:t>
       </w:r>
       <w:r>
         <w:rPr>
@@ -8982,7 +8982,7 @@
         <w:pStyle w:val="BodyTextNote"/>
       </w:pPr>
       <w:r>
-        <w:t xml:space="preserve">Furthermore, by statute, the Commission may re-litigate matters only if exceptions are filed, or if the Commission decides to review the matter as if exceptions had been filed “on its own motion before the order becomes the order of the commission . . . .”</w:t>
+        <w:t xml:space="preserve">Furthermore, by statute, the Commission may re-litigate matters only if exceptions are filed, or if the Commission decides to review the matter as if exceptions had been filed “on its own motion before the order becomes the order of the commission ⁠. ⁠. ⁠. ⁠.”</w:t>
       </w:r>
       <w:r>
         <w:rPr>
@@ -11829,7 +11829,7 @@
         <w:t xml:space="preserve"> </w:t>
       </w:r>
       <w:r>
-        <w:t xml:space="preserve">Thus the same public policy considerations to “protect[ ] a certificate holder against unnecessary duplication or competition[,]” and “[e]ncourage the well-planned development of utility resources in a manner consistent with state needs[,]”</w:t>
+        <w:t xml:space="preserve">Thus the same public policy considerations to “protect[ ⁠] a certificate holder against unnecessary duplication or competition[,]” and “[e]ncourage the well-planned development of utility resources in a manner consistent with state needs[,]”</w:t>
       </w:r>
       <w:r>
         <w:rPr>
@@ -11869,7 +11869,7 @@
         <w:pStyle w:val="BodyTextNote"/>
       </w:pPr>
       <w:r>
-        <w:t xml:space="preserve">To the contrary, municipalities are specifically prohibited from using the right of eminent domain to acquire property to construct waterworks beyond their corporate limits “to supply service in competition with an existing privately . . . owned waterworks . . . in such municipality or county or within the proposed extension of such system, unless a certificate of public convenience and necessity . . . [has] been issued by the Public Service Commission[.]”</w:t>
+        <w:t xml:space="preserve">To the contrary, municipalities are specifically prohibited from using the right of eminent domain to acquire property to construct waterworks beyond their corporate limits “to supply service in competition with an existing privately ⁠. ⁠. ⁠. owned waterworks ⁠. ⁠. ⁠. in such municipality or county or within the proposed extension of such system, unless a certificate of public convenience and necessity ⁠. ⁠. ⁠. [has] been issued by the Public Service Commission[.]”</w:t>
       </w:r>
       <w:r>
         <w:rPr>
@@ -12769,7 +12769,7 @@
         <w:t xml:space="preserve"> </w:t>
       </w:r>
       <w:r>
-        <w:t xml:space="preserve">are unfounded. The statute nowhere authorizes public utilities to construct competing facilities in the exclusive territory of private utility companies, nor does it purport to overrule the Commission’s well-established precedent concerning utilities. The program allows development fund grants for the extension of existing facilities for construction within a utility’s service territory—i.e., BWC’s exclusive territory in the Site. And Mount Hope may construct other utility facilities to make the Site ready for industrial development, short of constructing facilities in direct competition with BWC for water service at the Site. But the statute does not change the legislative imperative to “protect[ ] a certificate holder against unnecessary duplication or competition,” and “[e]ncourage the well-planned development of utility resources in a manner consistent with state needs[.]”</w:t>
+        <w:t xml:space="preserve">are unfounded. The statute nowhere authorizes public utilities to construct competing facilities in the exclusive territory of private utility companies, nor does it purport to overrule the Commission’s well-established precedent concerning utilities. The program allows development fund grants for the extension of existing facilities for construction within a utility’s service territory—i.e., BWC’s exclusive territory in the Site. And Mount Hope may construct other utility facilities to make the Site ready for industrial development, short of constructing facilities in direct competition with BWC for water service at the Site. But the statute does not change the legislative imperative to “protect[ ⁠] a certificate holder against unnecessary duplication or competition,” and “[e]ncourage the well-planned development of utility resources in a manner consistent with state needs[.]”</w:t>
       </w:r>
       <w:r>
         <w:rPr>
@@ -12803,7 +12803,7 @@
         <w:t xml:space="preserve"> </w:t>
       </w:r>
       <w:r>
-        <w:t xml:space="preserve">Indeed, the Commission traditionally hears complaints regarding planned construction of utility works. For example, the Commission decided a question concerning a territorial dispute premised on MPC having “placed stakes on the Goff property for the construction of new infrastructure and install[ing] a new pad mount for a transformer on the property . . . .”</w:t>
+        <w:t xml:space="preserve">Indeed, the Commission traditionally hears complaints regarding planned construction of utility works. For example, the Commission decided a question concerning a territorial dispute premised on MPC having “placed stakes on the Goff property for the construction of new infrastructure and install[ing] a new pad mount for a transformer on the property ⁠. ⁠. ⁠. ⁠.”</w:t>
       </w:r>
       <w:r>
         <w:rPr>
@@ -15776,7 +15776,7 @@
         <w:noBreakHyphen/>
       </w:r>
       <w:r>
-        <w:t xml:space="preserve">0747-E-C, at 1 (Comm’n Order, Sept. 18, 1997) (https://​www.​psc.​state.​wv.​us/​Scripts/​FullTextOrderSearch/​ViewArchiveDocument.​cfm?​CaseActivityID=76164&amp;Source=Archive).</w:t>
+        <w:t xml:space="preserve">0747-E-C, at 1 (Comm’n Order, Sept. 18, 1997) (https://​www.​psc.​state.​wv.​us/​Scripts/​FullTextOrderSearch/​ViewArchiveDocument.​cfm?​CaseActivityID=76164&amp;​Source=Archive).</w:t>
       </w:r>
     </w:p>
   </w:footnote>
@@ -16527,7 +16527,7 @@
         <w:noBreakHyphen/>
       </w:r>
       <w:r>
-        <w:t xml:space="preserve">749-G-C (Comm’n Order, Sept. 29, 1987) at Conclusion of Law 8 (https://​www.​psc.​state.​wv.​us/​Scripts/​FullTextOrderSearch/​ViewArchiveDocument.​cfm?​CaseActivityID=29286&amp;Source=Archive).</w:t>
+        <w:t xml:space="preserve">749-G-C (Comm’n Order, Sept. 29, 1987) at Conclusion of Law 8 (https://​www.​psc.​state.​wv.​us/​Scripts/​FullTextOrderSearch/​ViewArchiveDocument.​cfm?​CaseActivityID=29286&amp;​Source=Archive).</w:t>
       </w:r>
     </w:p>
   </w:footnote>
@@ -17495,7 +17495,7 @@
         <w:noBreakHyphen/>
       </w:r>
       <w:r>
-        <w:t xml:space="preserve">0747-E-C, at 1, 4 (Comm’n Order, Sept. 18, 1997), https://​www.​psc.​state.​wv.​us/​Scripts/​FullTextOrderSearch/​ViewArchiveDocument.​cfm?​CaseActivityID=76164&amp;Source=Archive, last accessed May 15, 2025.</w:t>
+        <w:t xml:space="preserve">0747-E-C, at 1, 4 (Comm’n Order, Sept. 18, 1997), https://​www.​psc.​state.​wv.​us/​Scripts/​FullTextOrderSearch/​ViewArchiveDocument.​cfm?​CaseActivityID=76164&amp;​Source=Archive, last accessed May 15, 2025.</w:t>
       </w:r>
     </w:p>
   </w:footnote>
@@ -17541,7 +17541,7 @@
         <w:noBreakHyphen/>
       </w:r>
       <w:r>
-        <w:t xml:space="preserve">0747-E-C, at 1, 4 (Comm’n Order, Sept. 18, 1997), https://​www.​psc.​state.​wv.​us/​Scripts/​FullTextOrderSearch/​ViewArchiveDocument.​cfm?​CaseActivityID=76164&amp;Source=Archive, last accessed May 15, 2025.</w:t>
+        <w:t xml:space="preserve">0747-E-C, at 1, 4 (Comm’n Order, Sept. 18, 1997), https://​www.​psc.​state.​wv.​us/​Scripts/​FullTextOrderSearch/​ViewArchiveDocument.​cfm?​CaseActivityID=76164&amp;​Source=Archive, last accessed May 15, 2025.</w:t>
       </w:r>
     </w:p>
   </w:footnote>

</xml_diff>